<commit_message>
procuracao de indeferimento: texto OFICIAL do Juvenill + campo CPF do representante
Modelo enviado na integra (verbatim). A ressalva agora AUTORIZA o recurso
(era exclusao no modelo de oposicao) e restringe cessao/desistencia/renuncia/
acordo/judicial; exigencias so quando previamente autorizadas.

Novo campo 'CPF do representante' no formulario de documentos (marcador
CPF_REP), exigido no bloco de assinatura desse modelo; em PF cai no CPF do
proprio cliente automaticamente.

Co-Authored-By: Claude Opus 4.8 <noreply@anthropic.com>
</commit_message>
<xml_diff>
--- a/admin/tpl/procuracao-indeferimento.docx
+++ b/admin/tpl/procuracao-indeferimento.docx
@@ -37,10 +37,33 @@
       </w:pPr>
       <w:r>
         <w:rPr>
-          <w:sz w:val="22"/>
-          <w:szCs w:val="22"/>
-        </w:rPr>
-        <w:t xml:space="preserve">{{CLIENTE_MAI}}, {{QUALIFICACAO_SEDE}}.</w:t>
+          <w:b/>
+          <w:sz w:val="22"/>
+          <w:szCs w:val="22"/>
+        </w:rPr>
+        <w:t xml:space="preserve">{{CLIENTE_MAI}}</w:t>
+      </w:r>
+      <w:r>
+        <w:rPr>
+          <w:sz w:val="22"/>
+          <w:szCs w:val="22"/>
+        </w:rPr>
+        <w:t xml:space="preserve">, {{QUALIFICACAO}}, doravante denominado(a) </w:t>
+      </w:r>
+      <w:r>
+        <w:rPr>
+          <w:b/>
+          <w:sz w:val="22"/>
+          <w:szCs w:val="22"/>
+        </w:rPr>
+        <w:t xml:space="preserve">OUTORGANTE</w:t>
+      </w:r>
+      <w:r>
+        <w:rPr>
+          <w:sz w:val="22"/>
+          <w:szCs w:val="22"/>
+        </w:rPr>
+        <w:t xml:space="preserve">.</w:t>
       </w:r>
     </w:p>
     <w:p>
@@ -64,10 +87,93 @@
       </w:pPr>
       <w:r>
         <w:rPr>
-          <w:sz w:val="22"/>
-          <w:szCs w:val="22"/>
-        </w:rPr>
-        <w:t xml:space="preserve">CAMILA DE LIZ PEREIRA, brasileira, casada, advogada, inscrita na OAB/SC sob o nº 32.680, RG nº 5.154.195 SSP/SC, CPF nº 006.928.439-30, e-mail contato@livpi.com.br, com escritório profissional à Rua Vergílio Ramos, nº 73, Lages/SC.</w:t>
+          <w:b/>
+          <w:sz w:val="22"/>
+          <w:szCs w:val="22"/>
+        </w:rPr>
+        <w:t xml:space="preserve">CAMILA DE LIZ PEREIRA</w:t>
+      </w:r>
+      <w:r>
+        <w:rPr>
+          <w:sz w:val="22"/>
+          <w:szCs w:val="22"/>
+        </w:rPr>
+        <w:t xml:space="preserve">, brasileira, casada, advogada, inscrita na OAB/SC sob o nº </w:t>
+      </w:r>
+      <w:r>
+        <w:rPr>
+          <w:b/>
+          <w:sz w:val="22"/>
+          <w:szCs w:val="22"/>
+        </w:rPr>
+        <w:t xml:space="preserve">32.680</w:t>
+      </w:r>
+      <w:r>
+        <w:rPr>
+          <w:sz w:val="22"/>
+          <w:szCs w:val="22"/>
+        </w:rPr>
+        <w:t xml:space="preserve">, RG nº </w:t>
+      </w:r>
+      <w:r>
+        <w:rPr>
+          <w:b/>
+          <w:sz w:val="22"/>
+          <w:szCs w:val="22"/>
+        </w:rPr>
+        <w:t xml:space="preserve">5.154.195 SSP/SC</w:t>
+      </w:r>
+      <w:r>
+        <w:rPr>
+          <w:sz w:val="22"/>
+          <w:szCs w:val="22"/>
+        </w:rPr>
+        <w:t xml:space="preserve">, CPF nº </w:t>
+      </w:r>
+      <w:r>
+        <w:rPr>
+          <w:b/>
+          <w:sz w:val="22"/>
+          <w:szCs w:val="22"/>
+        </w:rPr>
+        <w:t xml:space="preserve">006.928.439-30</w:t>
+      </w:r>
+      <w:r>
+        <w:rPr>
+          <w:sz w:val="22"/>
+          <w:szCs w:val="22"/>
+        </w:rPr>
+        <w:t xml:space="preserve">, e-mail </w:t>
+      </w:r>
+      <w:r>
+        <w:rPr>
+          <w:b/>
+          <w:sz w:val="22"/>
+          <w:szCs w:val="22"/>
+        </w:rPr>
+        <w:t xml:space="preserve">contato@livpi.com.br</w:t>
+      </w:r>
+      <w:r>
+        <w:rPr>
+          <w:sz w:val="22"/>
+          <w:szCs w:val="22"/>
+        </w:rPr>
+        <w:t xml:space="preserve">, com escritório profissional à Rua Vergílio Ramos, nº 73, Lages/SC, doravante denominada </w:t>
+      </w:r>
+      <w:r>
+        <w:rPr>
+          <w:b/>
+          <w:sz w:val="22"/>
+          <w:szCs w:val="22"/>
+        </w:rPr>
+        <w:t xml:space="preserve">OUTORGADA</w:t>
+      </w:r>
+      <w:r>
+        <w:rPr>
+          <w:sz w:val="22"/>
+          <w:szCs w:val="22"/>
+        </w:rPr>
+        <w:t xml:space="preserve">.</w:t>
       </w:r>
     </w:p>
     <w:p>
@@ -94,7 +200,67 @@
           <w:sz w:val="22"/>
           <w:szCs w:val="22"/>
         </w:rPr>
-        <w:t xml:space="preserve">Representação do OUTORGANTE perante o Instituto Nacional da Propriedade Industrial – INPI, especificamente para fins de elaboração, apresentação e acompanhamento de recurso contra a decisão de indeferimento proferida no pedido de registro da marca {{MARCA}}, processo nº {{PROCESSO}}.</w:t>
+        <w:t xml:space="preserve">Representação do OUTORGANTE perante o </w:t>
+      </w:r>
+      <w:r>
+        <w:rPr>
+          <w:b/>
+          <w:sz w:val="22"/>
+          <w:szCs w:val="22"/>
+        </w:rPr>
+        <w:t xml:space="preserve">Instituto Nacional da Propriedade Industrial – INPI</w:t>
+      </w:r>
+      <w:r>
+        <w:rPr>
+          <w:sz w:val="22"/>
+          <w:szCs w:val="22"/>
+        </w:rPr>
+        <w:t xml:space="preserve">, especificamente para fins de </w:t>
+      </w:r>
+      <w:r>
+        <w:rPr>
+          <w:b/>
+          <w:sz w:val="22"/>
+          <w:szCs w:val="22"/>
+        </w:rPr>
+        <w:t xml:space="preserve">análise, elaboração, interposição e acompanhamento de recurso administrativo contra a decisão de indeferimento</w:t>
+      </w:r>
+      <w:r>
+        <w:rPr>
+          <w:sz w:val="22"/>
+          <w:szCs w:val="22"/>
+        </w:rPr>
+        <w:t xml:space="preserve"> do pedido de registro da marca </w:t>
+      </w:r>
+      <w:r>
+        <w:rPr>
+          <w:b/>
+          <w:sz w:val="22"/>
+          <w:szCs w:val="22"/>
+        </w:rPr>
+        <w:t xml:space="preserve">“{{MARCA}}”</w:t>
+      </w:r>
+      <w:r>
+        <w:rPr>
+          <w:sz w:val="22"/>
+          <w:szCs w:val="22"/>
+        </w:rPr>
+        <w:t xml:space="preserve">, processo nº </w:t>
+      </w:r>
+      <w:r>
+        <w:rPr>
+          <w:b/>
+          <w:sz w:val="22"/>
+          <w:szCs w:val="22"/>
+        </w:rPr>
+        <w:t xml:space="preserve">{{PROCESSO}}</w:t>
+      </w:r>
+      <w:r>
+        <w:rPr>
+          <w:sz w:val="22"/>
+          <w:szCs w:val="22"/>
+        </w:rPr>
+        <w:t xml:space="preserve">.</w:t>
       </w:r>
     </w:p>
     <w:p>
@@ -121,7 +287,67 @@
           <w:sz w:val="22"/>
           <w:szCs w:val="22"/>
         </w:rPr>
-        <w:t xml:space="preserve">Pelo presente instrumento, o OUTORGANTE nomeia e constitui sua bastante procuradora a OUTORGADA, conferindo-lhe poderes para representá-lo perante o Instituto Nacional da Propriedade Industrial – INPI, especificamente no âmbito do pedido de registro da marca {{MARCA}}, processo nº {{PROCESSO}}, para fins de interposição, apresentação e acompanhamento de recurso contra a decisão de indeferimento.</w:t>
+        <w:t xml:space="preserve">Pelo presente instrumento, o OUTORGANTE nomeia e constitui sua bastante procuradora a OUTORGADA, conferindo-lhe poderes para representá-lo perante o </w:t>
+      </w:r>
+      <w:r>
+        <w:rPr>
+          <w:b/>
+          <w:sz w:val="22"/>
+          <w:szCs w:val="22"/>
+        </w:rPr>
+        <w:t xml:space="preserve">Instituto Nacional da Propriedade Industrial – INPI</w:t>
+      </w:r>
+      <w:r>
+        <w:rPr>
+          <w:sz w:val="22"/>
+          <w:szCs w:val="22"/>
+        </w:rPr>
+        <w:t xml:space="preserve">, especificamente no âmbito do processo nº </w:t>
+      </w:r>
+      <w:r>
+        <w:rPr>
+          <w:b/>
+          <w:sz w:val="22"/>
+          <w:szCs w:val="22"/>
+        </w:rPr>
+        <w:t xml:space="preserve">{{PROCESSO}}</w:t>
+      </w:r>
+      <w:r>
+        <w:rPr>
+          <w:sz w:val="22"/>
+          <w:szCs w:val="22"/>
+        </w:rPr>
+        <w:t xml:space="preserve">, relativo ao pedido de registro da marca </w:t>
+      </w:r>
+      <w:r>
+        <w:rPr>
+          <w:b/>
+          <w:sz w:val="22"/>
+          <w:szCs w:val="22"/>
+        </w:rPr>
+        <w:t xml:space="preserve">“{{MARCA}}”</w:t>
+      </w:r>
+      <w:r>
+        <w:rPr>
+          <w:sz w:val="22"/>
+          <w:szCs w:val="22"/>
+        </w:rPr>
+        <w:t xml:space="preserve">, com a finalidade de </w:t>
+      </w:r>
+      <w:r>
+        <w:rPr>
+          <w:b/>
+          <w:sz w:val="22"/>
+          <w:szCs w:val="22"/>
+        </w:rPr>
+        <w:t xml:space="preserve">interpor e acompanhar recurso administrativo contra a decisão de indeferimento</w:t>
+      </w:r>
+      <w:r>
+        <w:rPr>
+          <w:sz w:val="22"/>
+          <w:szCs w:val="22"/>
+        </w:rPr>
+        <w:t xml:space="preserve">.</w:t>
       </w:r>
     </w:p>
     <w:p>
@@ -134,7 +360,22 @@
           <w:sz w:val="22"/>
           <w:szCs w:val="22"/>
         </w:rPr>
-        <w:t xml:space="preserve">Para o cumprimento deste mandato, poderá a OUTORGADA protocolar o recurso, petições e manifestações, apresentar documentos, provas, argumentos e esclarecimentos, cumprir exigências diretamente relacionadas ao recurso objeto deste mandato, consultar e acompanhar o processo, solicitar informações, vistas e cópias, providenciar e acompanhar o recolhimento de taxas e retribuições eventualmente necessárias, receber comunicações administrativas e praticar os demais atos perante o INPI que sejam necessários à adequada interposição e acompanhamento do recurso.</w:t>
+        <w:t xml:space="preserve">Para o cumprimento deste mandato, poderá a OUTORGADA </w:t>
+      </w:r>
+      <w:r>
+        <w:rPr>
+          <w:b/>
+          <w:sz w:val="22"/>
+          <w:szCs w:val="22"/>
+        </w:rPr>
+        <w:t xml:space="preserve">protocolar recurso, petições e manifestações diretamente relacionadas ao procedimento recursal; apresentar documentos, provas, argumentos e esclarecimentos; consultar e acompanhar o processo; solicitar informações, vistas e cópias; cumprir exigências diretamente relacionadas ao processamento do recurso, quando previamente autorizadas pelo OUTORGANTE; providenciar e acompanhar o recolhimento de taxas e retribuições perante o INPI; receber comunicações administrativas; e praticar os demais atos necessários à adequada apresentação e acompanhamento do recurso administrativo</w:t>
+      </w:r>
+      <w:r>
+        <w:rPr>
+          <w:sz w:val="22"/>
+          <w:szCs w:val="22"/>
+        </w:rPr>
+        <w:t xml:space="preserve">.</w:t>
       </w:r>
     </w:p>
     <w:p>
@@ -147,16 +388,47 @@
           <w:sz w:val="22"/>
           <w:szCs w:val="22"/>
         </w:rPr>
-        <w:t xml:space="preserve">Os poderes conferidos por este instrumento ficam restritos à atuação administrativa relacionada ao recurso no processo nº {{PROCESSO}}, não abrangendo poderes para ceder ou transferir a marca ou o pedido de registro, desistir do pedido, renunciar a direitos, reconhecer direitos ou pretensões de terceiros, celebrar acordos, apresentar defesa a oposições, depositar novo pedido de registro, atuar em processo administrativo de nulidade ou promover medidas judiciais, salvo mediante nova autorização expressa do OUTORGANTE.</w:t>
-      </w:r>
-    </w:p>
-    <w:p>
-      <w:pPr>
-        <w:jc w:val="both"/>
-        <w:spacing w:after="760" w:line="276" w:lineRule="auto"/>
-      </w:pPr>
-      <w:r>
-        <w:rPr>
+        <w:t xml:space="preserve">Os poderes conferidos por este instrumento ficam </w:t>
+      </w:r>
+      <w:r>
+        <w:rPr>
+          <w:b/>
+          <w:sz w:val="22"/>
+          <w:szCs w:val="22"/>
+        </w:rPr>
+        <w:t xml:space="preserve">restritos à atuação administrativa relacionada ao recurso contra o indeferimento do processo nº {{PROCESSO}}</w:t>
+      </w:r>
+      <w:r>
+        <w:rPr>
+          <w:sz w:val="22"/>
+          <w:szCs w:val="22"/>
+        </w:rPr>
+        <w:t xml:space="preserve">, não abrangendo poderes para </w:t>
+      </w:r>
+      <w:r>
+        <w:rPr>
+          <w:b/>
+          <w:sz w:val="22"/>
+          <w:szCs w:val="22"/>
+        </w:rPr>
+        <w:t xml:space="preserve">ceder ou transferir a marca ou o pedido de registro, desistir do pedido, renunciar a direitos, reconhecer direitos ou pretensões de terceiros, celebrar acordos, promover medidas judiciais, ajuizar ações ou praticar atos de disposição sobre a titularidade da marca</w:t>
+      </w:r>
+      <w:r>
+        <w:rPr>
+          <w:sz w:val="22"/>
+          <w:szCs w:val="22"/>
+        </w:rPr>
+        <w:t xml:space="preserve">, salvo mediante nova autorização expressa do OUTORGANTE.</w:t>
+      </w:r>
+    </w:p>
+    <w:p>
+      <w:pPr>
+        <w:jc w:val="both"/>
+        <w:spacing w:after="700" w:line="276" w:lineRule="auto"/>
+      </w:pPr>
+      <w:r>
+        <w:rPr>
+          <w:b/>
           <w:sz w:val="22"/>
           <w:szCs w:val="22"/>
         </w:rPr>
@@ -166,41 +438,41 @@
     <w:p>
       <w:pPr>
         <w:jc w:val="center"/>
-        <w:spacing w:after="50" w:line="276" w:lineRule="auto"/>
-      </w:pPr>
-      <w:r>
-        <w:rPr>
-          <w:sz w:val="22"/>
-          <w:szCs w:val="22"/>
-        </w:rPr>
-        <w:t xml:space="preserve">_______________________________________________</w:t>
+        <w:spacing w:after="40" w:line="276" w:lineRule="auto"/>
+      </w:pPr>
+      <w:r>
+        <w:rPr>
+          <w:b/>
+          <w:sz w:val="22"/>
+          <w:szCs w:val="22"/>
+        </w:rPr>
+        <w:t xml:space="preserve">{{CLIENTE_MAI}}</w:t>
       </w:r>
     </w:p>
     <w:p>
       <w:pPr>
         <w:jc w:val="center"/>
-        <w:spacing w:after="30" w:line="276" w:lineRule="auto"/>
-      </w:pPr>
-      <w:r>
-        <w:rPr>
-          <w:b/>
-          <w:sz w:val="22"/>
-          <w:szCs w:val="22"/>
-        </w:rPr>
-        <w:t xml:space="preserve">{{CLIENTE_MAI}}</w:t>
+        <w:spacing w:after="40" w:line="276" w:lineRule="auto"/>
+      </w:pPr>
+      <w:r>
+        <w:rPr>
+          <w:sz w:val="22"/>
+          <w:szCs w:val="22"/>
+        </w:rPr>
+        <w:t xml:space="preserve">Representado(a) por: {{REPRESENTANTE}}</w:t>
       </w:r>
     </w:p>
     <w:p>
       <w:pPr>
         <w:jc w:val="center"/>
-        <w:spacing w:after="30" w:line="276" w:lineRule="auto"/>
-      </w:pPr>
-      <w:r>
-        <w:rPr>
-          <w:sz w:val="22"/>
-          <w:szCs w:val="22"/>
-        </w:rPr>
-        <w:t xml:space="preserve">OUTORGANTE</w:t>
+        <w:spacing w:after="60" w:line="276" w:lineRule="auto"/>
+      </w:pPr>
+      <w:r>
+        <w:rPr>
+          <w:sz w:val="22"/>
+          <w:szCs w:val="22"/>
+        </w:rPr>
+        <w:t xml:space="preserve">CPF: {{CPF_REP}}</w:t>
       </w:r>
     </w:p>
     <w:p>
@@ -213,7 +485,7 @@
           <w:sz w:val="22"/>
           <w:szCs w:val="22"/>
         </w:rPr>
-        <w:t xml:space="preserve">Representante: {{REPRESENTANTE}}</w:t>
+        <w:t xml:space="preserve">Assinatura: ______________________________________</w:t>
       </w:r>
     </w:p>
     <w:sectPr>

</xml_diff>